<commit_message>
mise a jour bdd
</commit_message>
<xml_diff>
--- a/Serveur VPS.docx
+++ b/Serveur VPS.docx
@@ -81,6 +81,68 @@
     </w:p>
     <w:p/>
     <w:p>
+      <w:pPr>
+        <w:spacing w:after="0"/>
+      </w:pPr>
+      <w:r>
+        <w:t xml:space="preserve">Démarrer mon serveur local sur </w:t>
+      </w:r>
+      <w:r>
+        <w:t>http://localhost:3000/</w:t>
+      </w:r>
+    </w:p>
+    <w:p>
+      <w:pPr>
+        <w:spacing w:after="0"/>
+      </w:pPr>
+      <w:r>
+        <w:t>En regardant ton package.json, tu as deux scripts définis :</w:t>
+      </w:r>
+    </w:p>
+    <w:p>
+      <w:pPr>
+        <w:numPr>
+          <w:ilvl w:val="0"/>
+          <w:numId w:val="10"/>
+        </w:numPr>
+        <w:spacing w:after="0"/>
+      </w:pPr>
+      <w:r>
+        <w:t>npm start — lance le serveur avec node server.js</w:t>
+      </w:r>
+    </w:p>
+    <w:p>
+      <w:pPr>
+        <w:numPr>
+          <w:ilvl w:val="0"/>
+          <w:numId w:val="10"/>
+        </w:numPr>
+        <w:spacing w:after="0"/>
+      </w:pPr>
+      <w:r>
+        <w:rPr>
+          <w:b/>
+          <w:bCs/>
+        </w:rPr>
+        <w:t>npm run dev</w:t>
+      </w:r>
+      <w:r>
+        <w:t xml:space="preserve"> — lance avec node --watch server.js, qui redémarre automatiquement à chaque modification de fichier</w:t>
+      </w:r>
+    </w:p>
+    <w:p>
+      <w:pPr>
+        <w:spacing w:after="0"/>
+      </w:pPr>
+      <w:r>
+        <w:t>Si tu veux un redémarrage manuel, tu kill le process (Ctrl+C) puis tu relances avec l'une des deux commandes. En dev, npm run dev est plus pratique puisque tu n'as pas à le faire manuellement.</w:t>
+      </w:r>
+    </w:p>
+    <w:p/>
+    <w:p>
+      <w:pPr>
+        <w:spacing w:after="0"/>
+      </w:pPr>
       <w:r>
         <w:t xml:space="preserve">SSH : </w:t>
       </w:r>
@@ -100,11 +162,17 @@
       </w:hyperlink>
     </w:p>
     <w:p>
+      <w:pPr>
+        <w:spacing w:after="0"/>
+      </w:pPr>
       <w:r>
         <w:t>Et tu te retrouves sur ubuntu</w:t>
       </w:r>
     </w:p>
     <w:p>
+      <w:pPr>
+        <w:spacing w:after="0"/>
+      </w:pPr>
       <w:r>
         <w:t>Après un commit : git pull et pm2 restart portfolio</w:t>
       </w:r>
@@ -170,13 +238,7 @@
           <w:rPr>
             <w:rStyle w:val="Lienhypertexte"/>
           </w:rPr>
-          <w:t>https://github.com/guillaume-deloris/portfolio</w:t>
-        </w:r>
-        <w:r>
-          <w:rPr>
-            <w:rStyle w:val="Lienhypertexte"/>
-          </w:rPr>
-          <w:t>.git</w:t>
+          <w:t>https://github.com/guillaume-deloris/portfolio.git</w:t>
         </w:r>
       </w:hyperlink>
     </w:p>
@@ -301,6 +363,7 @@
         <w:spacing w:after="0"/>
       </w:pPr>
       <w:r>
+        <w:lastRenderedPageBreak/>
         <w:t>la config nginx</w:t>
       </w:r>
     </w:p>
@@ -351,7 +414,6 @@
         <w:spacing w:after="0"/>
       </w:pPr>
       <w:r>
-        <w:lastRenderedPageBreak/>
         <w:t xml:space="preserve">        proxy_pass http://localhost:3000;</w:t>
       </w:r>
     </w:p>
@@ -600,14 +662,6 @@
         <w:spacing w:after="0"/>
       </w:pPr>
       <w:r>
-        <w:t>bash</w:t>
-      </w:r>
-    </w:p>
-    <w:p>
-      <w:pPr>
-        <w:spacing w:after="0"/>
-      </w:pPr>
-      <w:r>
         <w:t>apt install -y certbot python3-certbot-nginx &amp;&amp; certbot --nginx -d guillaumedeloris.fr -d www.guillaumedeloris.fr</w:t>
       </w:r>
     </w:p>
@@ -791,11 +845,59 @@
     </w:p>
     <w:p>
       <w:pPr>
-        <w:spacing w:after="0"/>
-      </w:pPr>
-      <w:r>
-        <w:t>Installe postgresql</w:t>
-      </w:r>
+        <w:pStyle w:val="grandTitre"/>
+      </w:pPr>
+      <w:r>
+        <w:t>Installe</w:t>
+      </w:r>
+      <w:r>
+        <w:t>r</w:t>
+      </w:r>
+      <w:r>
+        <w:t xml:space="preserve"> postgresql</w:t>
+      </w:r>
+    </w:p>
+    <w:p>
+      <w:pPr>
+        <w:spacing w:after="0"/>
+      </w:pPr>
+      <w:r>
+        <w:t>Installer postgresql sur le vps et en local. Créer les 2 baese de données.</w:t>
+      </w:r>
+    </w:p>
+    <w:p>
+      <w:pPr>
+        <w:spacing w:after="0"/>
+      </w:pPr>
+    </w:p>
+    <w:p>
+      <w:pPr>
+        <w:spacing w:after="0"/>
+      </w:pPr>
+      <w:r>
+        <w:t xml:space="preserve">Pour faire du sql en local : </w:t>
+      </w:r>
+      <w:r>
+        <w:t>psql -U postgres</w:t>
+      </w:r>
+    </w:p>
+    <w:p>
+      <w:pPr>
+        <w:spacing w:after="0"/>
+      </w:pPr>
+      <w:r>
+        <w:t>Ou sinon avec dbeaver</w:t>
+      </w:r>
+    </w:p>
+    <w:p>
+      <w:pPr>
+        <w:spacing w:after="0"/>
+      </w:pPr>
+    </w:p>
+    <w:p>
+      <w:pPr>
+        <w:spacing w:after="0"/>
+      </w:pPr>
     </w:p>
     <w:p>
       <w:pPr>
@@ -857,7 +959,6 @@
           <w:b/>
           <w:bCs/>
         </w:rPr>
-        <w:lastRenderedPageBreak/>
         <w:t>Ou pour te connecter directement avec ton utilisateur portfolio sur ta base :</w:t>
       </w:r>
     </w:p>
@@ -925,7 +1026,16 @@
         <w:spacing w:after="0"/>
       </w:pPr>
       <w:r>
-        <w:t>CREATE USER portfolio WITH PASSWORD 'un_mot_de_passe_fort';</w:t>
+        <w:t>CREATE USER portfolio WITH PASSWORD '</w:t>
+      </w:r>
+      <w:r>
+        <w:t xml:space="preserve"> </w:t>
+      </w:r>
+      <w:r>
+        <w:t>portfolio123</w:t>
+      </w:r>
+      <w:r>
+        <w:t>';</w:t>
       </w:r>
     </w:p>
     <w:p>
@@ -967,49 +1077,72 @@
         <w:spacing w:after="0"/>
       </w:pPr>
       <w:r>
-        <w:t>gg-efa461x6e8ex921ex8e16x1a681x6e8e-66</w:t>
-      </w:r>
-    </w:p>
-    <w:p>
-      <w:pPr>
-        <w:spacing w:after="0"/>
-      </w:pPr>
-    </w:p>
-    <w:p>
-      <w:pPr>
-        <w:spacing w:after="0"/>
-      </w:pPr>
-    </w:p>
-    <w:p>
-      <w:pPr>
-        <w:spacing w:after="0"/>
-      </w:pPr>
-      <w:r>
-        <w:t>CREATE USER portfolio WITH PASSWORD 'gg-efa461x6e8ex921ex8e16x1a681x6e8e-66';</w:t>
-      </w:r>
-    </w:p>
-    <w:p>
-      <w:pPr>
-        <w:spacing w:after="0"/>
-      </w:pPr>
-    </w:p>
-    <w:p>
-      <w:pPr>
-        <w:spacing w:after="0"/>
-      </w:pPr>
-      <w:r>
-        <w:t>postgres=# CREATE USER portfolio WITH PASSWORD 'gg-efa461x6e8ex921ex8e16x1a681x6e8e-66';</w:t>
-      </w:r>
-    </w:p>
-    <w:p>
-      <w:pPr>
-        <w:spacing w:after="0"/>
-      </w:pPr>
-      <w:r>
-        <w:t xml:space="preserve">ça répond : </w:t>
-      </w:r>
-      <w:r>
-        <w:t>CREATE ROLE</w:t>
+        <w:t xml:space="preserve">Mdp sur le vps : </w:t>
+      </w:r>
+      <w:r>
+        <w:t>portfolio123</w:t>
+      </w:r>
+    </w:p>
+    <w:p>
+      <w:pPr>
+        <w:spacing w:after="0"/>
+      </w:pPr>
+      <w:r>
+        <w:t>Mdp en local : GG66-0190-3945/louangis!</w:t>
+      </w:r>
+    </w:p>
+    <w:p>
+      <w:pPr>
+        <w:spacing w:after="0"/>
+      </w:pPr>
+    </w:p>
+    <w:p>
+      <w:pPr>
+        <w:spacing w:after="0"/>
+      </w:pPr>
+    </w:p>
+    <w:p>
+      <w:pPr>
+        <w:spacing w:after="0"/>
+      </w:pPr>
+      <w:r>
+        <w:t>CREATE USER portfolio WITH PASSWORD '</w:t>
+      </w:r>
+      <w:r>
+        <w:t xml:space="preserve"> </w:t>
+      </w:r>
+      <w:r>
+        <w:t>portfolio123</w:t>
+      </w:r>
+      <w:r>
+        <w:t>';</w:t>
+      </w:r>
+    </w:p>
+    <w:p>
+      <w:pPr>
+        <w:spacing w:after="0"/>
+      </w:pPr>
+    </w:p>
+    <w:p>
+      <w:pPr>
+        <w:spacing w:after="0"/>
+      </w:pPr>
+      <w:r>
+        <w:t>postgres=# CREATE USER portfolio WITH PASSWORD '</w:t>
+      </w:r>
+      <w:r>
+        <w:t xml:space="preserve"> portfolio123</w:t>
+      </w:r>
+      <w:r>
+        <w:t>';</w:t>
+      </w:r>
+    </w:p>
+    <w:p>
+      <w:pPr>
+        <w:spacing w:after="0"/>
+      </w:pPr>
+      <w:r>
+        <w:t>ça répond : CREATE ROLE</w:t>
       </w:r>
     </w:p>
     <w:p>
@@ -1025,10 +1158,7 @@
         <w:spacing w:after="0"/>
       </w:pPr>
       <w:r>
-        <w:t xml:space="preserve">ça répond : </w:t>
-      </w:r>
-      <w:r>
-        <w:t>CREATE DATABASE</w:t>
+        <w:t>ça répond : CREATE DATABASE</w:t>
       </w:r>
     </w:p>
     <w:p>
@@ -1137,7 +1267,10 @@
         <w:spacing w:after="0"/>
       </w:pPr>
       <w:r>
-        <w:t>PG_PASSWORD=ton_mot_de_passe</w:t>
+        <w:t>PG_PASSWORD=</w:t>
+      </w:r>
+      <w:r>
+        <w:t>portfolio123</w:t>
       </w:r>
     </w:p>
     <w:p>
@@ -1187,6 +1320,7 @@
         <w:spacing w:after="0"/>
       </w:pPr>
       <w:r>
+        <w:lastRenderedPageBreak/>
         <w:t>npm install pg</w:t>
       </w:r>
     </w:p>
@@ -1517,15 +1651,170 @@
         <w:spacing w:after="0"/>
       </w:pPr>
       <w:r>
-        <w:t>Maintenant on va brancher ça dans ton server.js. Montre-moi le contenu de ton fichier :</w:t>
-      </w:r>
-    </w:p>
-    <w:p>
-      <w:pPr>
-        <w:spacing w:after="0"/>
-      </w:pPr>
-      <w:r>
-        <w:t>cat server.js</w:t>
+        <w:t>Il faut également installer postgresql en local</w:t>
+      </w:r>
+      <w:r>
+        <w:t xml:space="preserve"> comme ceci : </w:t>
+      </w:r>
+      <w:r>
+        <w:br/>
+        <w:t>télécharger postgresql, mettre à jour .env et ajouter le PATH dans les variable d’environnement Windows.</w:t>
+      </w:r>
+    </w:p>
+    <w:p>
+      <w:pPr>
+        <w:spacing w:after="0"/>
+      </w:pPr>
+      <w:r>
+        <w:br/>
+      </w:r>
+      <w:r>
+        <w:t>Crée la base :</w:t>
+      </w:r>
+    </w:p>
+    <w:p>
+      <w:pPr>
+        <w:spacing w:after="0"/>
+      </w:pPr>
+      <w:r>
+        <w:t>sql</w:t>
+      </w:r>
+    </w:p>
+    <w:p>
+      <w:pPr>
+        <w:spacing w:after="0"/>
+      </w:pPr>
+      <w:r>
+        <w:t>CREATE DATABASE portfolio_dev;</w:t>
+      </w:r>
+    </w:p>
+    <w:p>
+      <w:pPr>
+        <w:spacing w:after="0"/>
+      </w:pPr>
+      <w:r>
+        <w:t>Puis connecte-toi dessus :</w:t>
+      </w:r>
+    </w:p>
+    <w:p>
+      <w:pPr>
+        <w:spacing w:after="0"/>
+      </w:pPr>
+      <w:r>
+        <w:t>sql</w:t>
+      </w:r>
+    </w:p>
+    <w:p>
+      <w:pPr>
+        <w:spacing w:after="0"/>
+      </w:pPr>
+      <w:r>
+        <w:t>\c portfolio_dev</w:t>
+      </w:r>
+    </w:p>
+    <w:p>
+      <w:pPr>
+        <w:spacing w:after="0"/>
+      </w:pPr>
+      <w:r>
+        <w:t>Et crée les deux tables :</w:t>
+      </w:r>
+    </w:p>
+    <w:p>
+      <w:pPr>
+        <w:spacing w:after="0"/>
+      </w:pPr>
+      <w:r>
+        <w:t>sql</w:t>
+      </w:r>
+    </w:p>
+    <w:p>
+      <w:pPr>
+        <w:spacing w:after="0"/>
+      </w:pPr>
+      <w:r>
+        <w:lastRenderedPageBreak/>
+        <w:t>CREATE TABLE visits (</w:t>
+      </w:r>
+    </w:p>
+    <w:p>
+      <w:pPr>
+        <w:spacing w:after="0"/>
+      </w:pPr>
+      <w:r>
+        <w:t xml:space="preserve">    id SERIAL PRIMARY KEY,</w:t>
+      </w:r>
+    </w:p>
+    <w:p>
+      <w:pPr>
+        <w:spacing w:after="0"/>
+      </w:pPr>
+      <w:r>
+        <w:t xml:space="preserve">    visited_at TIMESTAMP NOT NULL</w:t>
+      </w:r>
+    </w:p>
+    <w:p>
+      <w:pPr>
+        <w:spacing w:after="0"/>
+      </w:pPr>
+      <w:r>
+        <w:t>);</w:t>
+      </w:r>
+    </w:p>
+    <w:p>
+      <w:pPr>
+        <w:spacing w:after="0"/>
+      </w:pPr>
+      <w:r>
+        <w:t>CREATE TABLE scores (</w:t>
+      </w:r>
+    </w:p>
+    <w:p>
+      <w:pPr>
+        <w:spacing w:after="0"/>
+      </w:pPr>
+      <w:r>
+        <w:t xml:space="preserve">    id SERIAL PRIMARY KEY,</w:t>
+      </w:r>
+    </w:p>
+    <w:p>
+      <w:pPr>
+        <w:spacing w:after="0"/>
+      </w:pPr>
+      <w:r>
+        <w:t xml:space="preserve">    player VARCHAR(100) NOT NULL,</w:t>
+      </w:r>
+    </w:p>
+    <w:p>
+      <w:pPr>
+        <w:spacing w:after="0"/>
+      </w:pPr>
+      <w:r>
+        <w:t xml:space="preserve">    game VARCHAR(100) NOT NULL,</w:t>
+      </w:r>
+    </w:p>
+    <w:p>
+      <w:pPr>
+        <w:spacing w:after="0"/>
+      </w:pPr>
+      <w:r>
+        <w:t xml:space="preserve">    score INTEGER NOT NULL,</w:t>
+      </w:r>
+    </w:p>
+    <w:p>
+      <w:pPr>
+        <w:spacing w:after="0"/>
+      </w:pPr>
+      <w:r>
+        <w:t xml:space="preserve">    created_at TIMESTAMP DEFAULT NOW()</w:t>
+      </w:r>
+    </w:p>
+    <w:p>
+      <w:pPr>
+        <w:spacing w:after="0"/>
+      </w:pPr>
+      <w:r>
+        <w:t>);</w:t>
       </w:r>
     </w:p>
     <w:p>
@@ -1606,6 +1895,155 @@
 <file path=word/numbering.xml><?xml version="1.0" encoding="utf-8"?>
 <w:numbering xmlns:wpc="http://schemas.microsoft.com/office/word/2010/wordprocessingCanvas" xmlns:cx="http://schemas.microsoft.com/office/drawing/2014/chartex" xmlns:cx1="http://schemas.microsoft.com/office/drawing/2015/9/8/chartex" xmlns:cx2="http://schemas.microsoft.com/office/drawing/2015/10/21/chartex" xmlns:cx3="http://schemas.microsoft.com/office/drawing/2016/5/9/chartex" xmlns:cx4="http://schemas.microsoft.com/office/drawing/2016/5/10/chartex" xmlns:cx5="http://schemas.microsoft.com/office/drawing/2016/5/11/chartex" xmlns:cx6="http://schemas.microsoft.com/office/drawing/2016/5/12/chartex" xmlns:cx7="http://schemas.microsoft.com/office/drawing/2016/5/13/chartex" xmlns:cx8="http://schemas.microsoft.com/office/drawing/2016/5/14/chartex" xmlns:mc="http://schemas.openxmlformats.org/markup-compatibility/2006" xmlns:aink="http://schemas.microsoft.com/office/drawing/2016/ink" xmlns:am3d="http://schemas.microsoft.com/office/drawing/2017/model3d" xmlns:o="urn:schemas-microsoft-com:office:office" xmlns:oel="http://schemas.microsoft.com/office/2019/extlst" xmlns:r="http://schemas.openxmlformats.org/officeDocument/2006/relationships" xmlns:m="http://schemas.openxmlformats.org/officeDocument/2006/math" xmlns:v="urn:schemas-microsoft-com:vml" xmlns:wp14="http://schemas.microsoft.com/office/word/2010/wordprocessingDrawing" xmlns:wp="http://schemas.openxmlformats.org/drawingml/2006/wordprocessingDrawing" xmlns:w10="urn:schemas-microsoft-com:office:word" xmlns:w="http://schemas.openxmlformats.org/wordprocessingml/2006/main" xmlns:w14="http://schemas.microsoft.com/office/word/2010/wordml" xmlns:w15="http://schemas.microsoft.com/office/word/2012/wordml" xmlns:w16cex="http://schemas.microsoft.com/office/word/2018/wordml/cex" xmlns:w16cid="http://schemas.microsoft.com/office/word/2016/wordml/cid" xmlns:w16="http://schemas.microsoft.com/office/word/2018/wordml" xmlns:w16du="http://schemas.microsoft.com/office/word/2023/wordml/word16du" xmlns:w16sdtdh="http://schemas.microsoft.com/office/word/2020/wordml/sdtdatahash" xmlns:w16sdtfl="http://schemas.microsoft.com/office/word/2024/wordml/sdtformatlock" xmlns:w16se="http://schemas.microsoft.com/office/word/2015/wordml/symex" xmlns:wpg="http://schemas.microsoft.com/office/word/2010/wordprocessingGroup" xmlns:wpi="http://schemas.microsoft.com/office/word/2010/wordprocessingInk" xmlns:wne="http://schemas.microsoft.com/office/word/2006/wordml" xmlns:wps="http://schemas.microsoft.com/office/word/2010/wordprocessingShape" mc:Ignorable="w14 w15 w16se w16cid w16 w16cex w16sdtdh w16sdtfl w16du wp14">
   <w:abstractNum w:abstractNumId="0" w15:restartNumberingAfterBreak="0">
+    <w:nsid w:val="09134219"/>
+    <w:multiLevelType w:val="multilevel"/>
+    <w:tmpl w:val="1390FF96"/>
+    <w:lvl w:ilvl="0">
+      <w:start w:val="1"/>
+      <w:numFmt w:val="bullet"/>
+      <w:lvlText w:val=""/>
+      <w:lvlJc w:val="left"/>
+      <w:pPr>
+        <w:tabs>
+          <w:tab w:val="num" w:pos="720"/>
+        </w:tabs>
+        <w:ind w:left="720" w:hanging="360"/>
+      </w:pPr>
+      <w:rPr>
+        <w:rFonts w:ascii="Symbol" w:hAnsi="Symbol" w:hint="default"/>
+        <w:sz w:val="20"/>
+      </w:rPr>
+    </w:lvl>
+    <w:lvl w:ilvl="1" w:tentative="1">
+      <w:start w:val="1"/>
+      <w:numFmt w:val="bullet"/>
+      <w:lvlText w:val="o"/>
+      <w:lvlJc w:val="left"/>
+      <w:pPr>
+        <w:tabs>
+          <w:tab w:val="num" w:pos="1440"/>
+        </w:tabs>
+        <w:ind w:left="1440" w:hanging="360"/>
+      </w:pPr>
+      <w:rPr>
+        <w:rFonts w:ascii="Courier New" w:hAnsi="Courier New" w:hint="default"/>
+        <w:sz w:val="20"/>
+      </w:rPr>
+    </w:lvl>
+    <w:lvl w:ilvl="2" w:tentative="1">
+      <w:start w:val="1"/>
+      <w:numFmt w:val="bullet"/>
+      <w:lvlText w:val=""/>
+      <w:lvlJc w:val="left"/>
+      <w:pPr>
+        <w:tabs>
+          <w:tab w:val="num" w:pos="2160"/>
+        </w:tabs>
+        <w:ind w:left="2160" w:hanging="360"/>
+      </w:pPr>
+      <w:rPr>
+        <w:rFonts w:ascii="Wingdings" w:hAnsi="Wingdings" w:hint="default"/>
+        <w:sz w:val="20"/>
+      </w:rPr>
+    </w:lvl>
+    <w:lvl w:ilvl="3" w:tentative="1">
+      <w:start w:val="1"/>
+      <w:numFmt w:val="bullet"/>
+      <w:lvlText w:val=""/>
+      <w:lvlJc w:val="left"/>
+      <w:pPr>
+        <w:tabs>
+          <w:tab w:val="num" w:pos="2880"/>
+        </w:tabs>
+        <w:ind w:left="2880" w:hanging="360"/>
+      </w:pPr>
+      <w:rPr>
+        <w:rFonts w:ascii="Wingdings" w:hAnsi="Wingdings" w:hint="default"/>
+        <w:sz w:val="20"/>
+      </w:rPr>
+    </w:lvl>
+    <w:lvl w:ilvl="4" w:tentative="1">
+      <w:start w:val="1"/>
+      <w:numFmt w:val="bullet"/>
+      <w:lvlText w:val=""/>
+      <w:lvlJc w:val="left"/>
+      <w:pPr>
+        <w:tabs>
+          <w:tab w:val="num" w:pos="3600"/>
+        </w:tabs>
+        <w:ind w:left="3600" w:hanging="360"/>
+      </w:pPr>
+      <w:rPr>
+        <w:rFonts w:ascii="Wingdings" w:hAnsi="Wingdings" w:hint="default"/>
+        <w:sz w:val="20"/>
+      </w:rPr>
+    </w:lvl>
+    <w:lvl w:ilvl="5" w:tentative="1">
+      <w:start w:val="1"/>
+      <w:numFmt w:val="bullet"/>
+      <w:lvlText w:val=""/>
+      <w:lvlJc w:val="left"/>
+      <w:pPr>
+        <w:tabs>
+          <w:tab w:val="num" w:pos="4320"/>
+        </w:tabs>
+        <w:ind w:left="4320" w:hanging="360"/>
+      </w:pPr>
+      <w:rPr>
+        <w:rFonts w:ascii="Wingdings" w:hAnsi="Wingdings" w:hint="default"/>
+        <w:sz w:val="20"/>
+      </w:rPr>
+    </w:lvl>
+    <w:lvl w:ilvl="6" w:tentative="1">
+      <w:start w:val="1"/>
+      <w:numFmt w:val="bullet"/>
+      <w:lvlText w:val=""/>
+      <w:lvlJc w:val="left"/>
+      <w:pPr>
+        <w:tabs>
+          <w:tab w:val="num" w:pos="5040"/>
+        </w:tabs>
+        <w:ind w:left="5040" w:hanging="360"/>
+      </w:pPr>
+      <w:rPr>
+        <w:rFonts w:ascii="Wingdings" w:hAnsi="Wingdings" w:hint="default"/>
+        <w:sz w:val="20"/>
+      </w:rPr>
+    </w:lvl>
+    <w:lvl w:ilvl="7" w:tentative="1">
+      <w:start w:val="1"/>
+      <w:numFmt w:val="bullet"/>
+      <w:lvlText w:val=""/>
+      <w:lvlJc w:val="left"/>
+      <w:pPr>
+        <w:tabs>
+          <w:tab w:val="num" w:pos="5760"/>
+        </w:tabs>
+        <w:ind w:left="5760" w:hanging="360"/>
+      </w:pPr>
+      <w:rPr>
+        <w:rFonts w:ascii="Wingdings" w:hAnsi="Wingdings" w:hint="default"/>
+        <w:sz w:val="20"/>
+      </w:rPr>
+    </w:lvl>
+    <w:lvl w:ilvl="8" w:tentative="1">
+      <w:start w:val="1"/>
+      <w:numFmt w:val="bullet"/>
+      <w:lvlText w:val=""/>
+      <w:lvlJc w:val="left"/>
+      <w:pPr>
+        <w:tabs>
+          <w:tab w:val="num" w:pos="6480"/>
+        </w:tabs>
+        <w:ind w:left="6480" w:hanging="360"/>
+      </w:pPr>
+      <w:rPr>
+        <w:rFonts w:ascii="Wingdings" w:hAnsi="Wingdings" w:hint="default"/>
+        <w:sz w:val="20"/>
+      </w:rPr>
+    </w:lvl>
+  </w:abstractNum>
+  <w:abstractNum w:abstractNumId="1" w15:restartNumberingAfterBreak="0">
     <w:nsid w:val="0F502D0D"/>
     <w:multiLevelType w:val="multilevel"/>
     <w:tmpl w:val="5F06C23A"/>
@@ -1692,7 +2130,7 @@
       </w:pPr>
     </w:lvl>
   </w:abstractNum>
-  <w:abstractNum w:abstractNumId="1" w15:restartNumberingAfterBreak="0">
+  <w:abstractNum w:abstractNumId="2" w15:restartNumberingAfterBreak="0">
     <w:nsid w:val="0FBA0686"/>
     <w:multiLevelType w:val="multilevel"/>
     <w:tmpl w:val="E092DBDA"/>
@@ -1780,7 +2218,7 @@
       </w:pPr>
     </w:lvl>
   </w:abstractNum>
-  <w:abstractNum w:abstractNumId="2" w15:restartNumberingAfterBreak="0">
+  <w:abstractNum w:abstractNumId="3" w15:restartNumberingAfterBreak="0">
     <w:nsid w:val="322E3C8D"/>
     <w:multiLevelType w:val="multilevel"/>
     <w:tmpl w:val="5C4AFF94"/>
@@ -1866,7 +2304,7 @@
       </w:pPr>
     </w:lvl>
   </w:abstractNum>
-  <w:abstractNum w:abstractNumId="3" w15:restartNumberingAfterBreak="0">
+  <w:abstractNum w:abstractNumId="4" w15:restartNumberingAfterBreak="0">
     <w:nsid w:val="328A1691"/>
     <w:multiLevelType w:val="hybridMultilevel"/>
     <w:tmpl w:val="8F46E7AE"/>
@@ -1952,7 +2390,7 @@
       </w:pPr>
     </w:lvl>
   </w:abstractNum>
-  <w:abstractNum w:abstractNumId="4" w15:restartNumberingAfterBreak="0">
+  <w:abstractNum w:abstractNumId="5" w15:restartNumberingAfterBreak="0">
     <w:nsid w:val="5249786F"/>
     <w:multiLevelType w:val="multilevel"/>
     <w:tmpl w:val="DA14C7F2"/>
@@ -2038,7 +2476,7 @@
       </w:pPr>
     </w:lvl>
   </w:abstractNum>
-  <w:abstractNum w:abstractNumId="5" w15:restartNumberingAfterBreak="0">
+  <w:abstractNum w:abstractNumId="6" w15:restartNumberingAfterBreak="0">
     <w:nsid w:val="531E7E1A"/>
     <w:multiLevelType w:val="multilevel"/>
     <w:tmpl w:val="F404009A"/>
@@ -2187,7 +2625,7 @@
       </w:rPr>
     </w:lvl>
   </w:abstractNum>
-  <w:abstractNum w:abstractNumId="6" w15:restartNumberingAfterBreak="0">
+  <w:abstractNum w:abstractNumId="7" w15:restartNumberingAfterBreak="0">
     <w:nsid w:val="7B426C46"/>
     <w:multiLevelType w:val="multilevel"/>
     <w:tmpl w:val="20D608EA"/>
@@ -2337,31 +2775,34 @@
     </w:lvl>
   </w:abstractNum>
   <w:num w:numId="1" w16cid:durableId="1041705356">
-    <w:abstractNumId w:val="0"/>
+    <w:abstractNumId w:val="1"/>
   </w:num>
   <w:num w:numId="2" w16cid:durableId="1362363112">
+    <w:abstractNumId w:val="5"/>
+  </w:num>
+  <w:num w:numId="3" w16cid:durableId="162009555">
+    <w:abstractNumId w:val="3"/>
+  </w:num>
+  <w:num w:numId="4" w16cid:durableId="914972643">
     <w:abstractNumId w:val="4"/>
   </w:num>
-  <w:num w:numId="3" w16cid:durableId="162009555">
+  <w:num w:numId="5" w16cid:durableId="450782510">
+    <w:abstractNumId w:val="4"/>
+  </w:num>
+  <w:num w:numId="6" w16cid:durableId="1589344232">
     <w:abstractNumId w:val="2"/>
   </w:num>
-  <w:num w:numId="4" w16cid:durableId="914972643">
-    <w:abstractNumId w:val="3"/>
-  </w:num>
-  <w:num w:numId="5" w16cid:durableId="450782510">
-    <w:abstractNumId w:val="3"/>
-  </w:num>
-  <w:num w:numId="6" w16cid:durableId="1589344232">
-    <w:abstractNumId w:val="1"/>
-  </w:num>
   <w:num w:numId="7" w16cid:durableId="1878347449">
-    <w:abstractNumId w:val="3"/>
+    <w:abstractNumId w:val="4"/>
   </w:num>
   <w:num w:numId="8" w16cid:durableId="1004628892">
+    <w:abstractNumId w:val="7"/>
+  </w:num>
+  <w:num w:numId="9" w16cid:durableId="856164673">
     <w:abstractNumId w:val="6"/>
   </w:num>
-  <w:num w:numId="9" w16cid:durableId="856164673">
-    <w:abstractNumId w:val="5"/>
+  <w:num w:numId="10" w16cid:durableId="1688756320">
+    <w:abstractNumId w:val="0"/>
   </w:num>
 </w:numbering>
 </file>
@@ -2998,6 +3439,7 @@
   <w:style w:type="character" w:default="1" w:styleId="Policepardfaut">
     <w:name w:val="Default Paragraph Font"/>
     <w:uiPriority w:val="1"/>
+    <w:semiHidden/>
     <w:unhideWhenUsed/>
   </w:style>
   <w:style w:type="table" w:default="1" w:styleId="TableauNormal">
@@ -3104,6 +3546,10 @@
       <w:numPr>
         <w:numId w:val="1"/>
       </w:numPr>
+      <w:tabs>
+        <w:tab w:val="num" w:pos="360"/>
+      </w:tabs>
+      <w:ind w:left="6528"/>
     </w:pPr>
     <w:rPr>
       <w:kern w:val="0"/>

</xml_diff>